<commit_message>
issues on leader election
</commit_message>
<xml_diff>
--- a/lab07-complete/lab07_student Instructions.docx
+++ b/lab07-complete/lab07_student Instructions.docx
@@ -23,12 +23,6 @@
         <w:gridCol w:w="9360"/>
       </w:tblGrid>
       <w:tr>
-        <w:tblPrEx>
-          <w:tblCellMar>
-            <w:top w:w="0" w:type="dxa"/>
-            <w:bottom w:w="0" w:type="dxa"/>
-          </w:tblCellMar>
-        </w:tblPrEx>
         <w:tc>
           <w:tcPr>
             <w:tcW w:w="9360" w:type="dxa"/>
@@ -131,12 +125,6 @@
         <w:gridCol w:w="9360"/>
       </w:tblGrid>
       <w:tr>
-        <w:tblPrEx>
-          <w:tblCellMar>
-            <w:top w:w="0" w:type="dxa"/>
-            <w:bottom w:w="0" w:type="dxa"/>
-          </w:tblCellMar>
-        </w:tblPrEx>
         <w:tc>
           <w:tcPr>
             <w:tcW w:w="9360" w:type="dxa"/>
@@ -223,12 +211,6 @@
         <w:gridCol w:w="6960"/>
       </w:tblGrid>
       <w:tr>
-        <w:tblPrEx>
-          <w:tblCellMar>
-            <w:top w:w="0" w:type="dxa"/>
-            <w:bottom w:w="0" w:type="dxa"/>
-          </w:tblCellMar>
-        </w:tblPrEx>
         <w:tc>
           <w:tcPr>
             <w:tcW w:w="2400" w:type="dxa"/>
@@ -291,12 +273,6 @@
         </w:tc>
       </w:tr>
       <w:tr>
-        <w:tblPrEx>
-          <w:tblCellMar>
-            <w:top w:w="0" w:type="dxa"/>
-            <w:bottom w:w="0" w:type="dxa"/>
-          </w:tblCellMar>
-        </w:tblPrEx>
         <w:tc>
           <w:tcPr>
             <w:tcW w:w="2400" w:type="dxa"/>
@@ -355,12 +331,6 @@
         </w:tc>
       </w:tr>
       <w:tr>
-        <w:tblPrEx>
-          <w:tblCellMar>
-            <w:top w:w="0" w:type="dxa"/>
-            <w:bottom w:w="0" w:type="dxa"/>
-          </w:tblCellMar>
-        </w:tblPrEx>
         <w:tc>
           <w:tcPr>
             <w:tcW w:w="2400" w:type="dxa"/>
@@ -419,12 +389,6 @@
         </w:tc>
       </w:tr>
       <w:tr>
-        <w:tblPrEx>
-          <w:tblCellMar>
-            <w:top w:w="0" w:type="dxa"/>
-            <w:bottom w:w="0" w:type="dxa"/>
-          </w:tblCellMar>
-        </w:tblPrEx>
         <w:tc>
           <w:tcPr>
             <w:tcW w:w="2400" w:type="dxa"/>
@@ -483,12 +447,6 @@
         </w:tc>
       </w:tr>
       <w:tr>
-        <w:tblPrEx>
-          <w:tblCellMar>
-            <w:top w:w="0" w:type="dxa"/>
-            <w:bottom w:w="0" w:type="dxa"/>
-          </w:tblCellMar>
-        </w:tblPrEx>
         <w:tc>
           <w:tcPr>
             <w:tcW w:w="2400" w:type="dxa"/>
@@ -547,12 +505,6 @@
         </w:tc>
       </w:tr>
       <w:tr>
-        <w:tblPrEx>
-          <w:tblCellMar>
-            <w:top w:w="0" w:type="dxa"/>
-            <w:bottom w:w="0" w:type="dxa"/>
-          </w:tblCellMar>
-        </w:tblPrEx>
         <w:tc>
           <w:tcPr>
             <w:tcW w:w="2400" w:type="dxa"/>
@@ -611,12 +563,6 @@
         </w:tc>
       </w:tr>
       <w:tr>
-        <w:tblPrEx>
-          <w:tblCellMar>
-            <w:top w:w="0" w:type="dxa"/>
-            <w:bottom w:w="0" w:type="dxa"/>
-          </w:tblCellMar>
-        </w:tblPrEx>
         <w:tc>
           <w:tcPr>
             <w:tcW w:w="2400" w:type="dxa"/>
@@ -729,12 +675,6 @@
         <w:gridCol w:w="9360"/>
       </w:tblGrid>
       <w:tr>
-        <w:tblPrEx>
-          <w:tblCellMar>
-            <w:top w:w="0" w:type="dxa"/>
-            <w:bottom w:w="0" w:type="dxa"/>
-          </w:tblCellMar>
-        </w:tblPrEx>
         <w:tc>
           <w:tcPr>
             <w:tcW w:w="9360" w:type="dxa"/>
@@ -869,12 +809,6 @@
         <w:gridCol w:w="9360"/>
       </w:tblGrid>
       <w:tr>
-        <w:tblPrEx>
-          <w:tblCellMar>
-            <w:top w:w="0" w:type="dxa"/>
-            <w:bottom w:w="0" w:type="dxa"/>
-          </w:tblCellMar>
-        </w:tblPrEx>
         <w:tc>
           <w:tcPr>
             <w:tcW w:w="9360" w:type="dxa"/>
@@ -1008,12 +942,6 @@
         <w:gridCol w:w="5760"/>
       </w:tblGrid>
       <w:tr>
-        <w:tblPrEx>
-          <w:tblCellMar>
-            <w:top w:w="0" w:type="dxa"/>
-            <w:bottom w:w="0" w:type="dxa"/>
-          </w:tblCellMar>
-        </w:tblPrEx>
         <w:tc>
           <w:tcPr>
             <w:tcW w:w="1400" w:type="dxa"/>
@@ -1106,12 +1034,6 @@
         </w:tc>
       </w:tr>
       <w:tr>
-        <w:tblPrEx>
-          <w:tblCellMar>
-            <w:top w:w="0" w:type="dxa"/>
-            <w:bottom w:w="0" w:type="dxa"/>
-          </w:tblCellMar>
-        </w:tblPrEx>
         <w:tc>
           <w:tcPr>
             <w:tcW w:w="1400" w:type="dxa"/>
@@ -1198,12 +1120,6 @@
         </w:tc>
       </w:tr>
       <w:tr>
-        <w:tblPrEx>
-          <w:tblCellMar>
-            <w:top w:w="0" w:type="dxa"/>
-            <w:bottom w:w="0" w:type="dxa"/>
-          </w:tblCellMar>
-        </w:tblPrEx>
         <w:tc>
           <w:tcPr>
             <w:tcW w:w="1400" w:type="dxa"/>
@@ -1290,12 +1206,6 @@
         </w:tc>
       </w:tr>
       <w:tr>
-        <w:tblPrEx>
-          <w:tblCellMar>
-            <w:top w:w="0" w:type="dxa"/>
-            <w:bottom w:w="0" w:type="dxa"/>
-          </w:tblCellMar>
-        </w:tblPrEx>
         <w:tc>
           <w:tcPr>
             <w:tcW w:w="1400" w:type="dxa"/>
@@ -1427,12 +1337,6 @@
         <w:gridCol w:w="9360"/>
       </w:tblGrid>
       <w:tr>
-        <w:tblPrEx>
-          <w:tblCellMar>
-            <w:top w:w="0" w:type="dxa"/>
-            <w:bottom w:w="0" w:type="dxa"/>
-          </w:tblCellMar>
-        </w:tblPrEx>
         <w:tc>
           <w:tcPr>
             <w:tcW w:w="9360" w:type="dxa"/>
@@ -1566,12 +1470,6 @@
         <w:gridCol w:w="4360"/>
       </w:tblGrid>
       <w:tr>
-        <w:tblPrEx>
-          <w:tblCellMar>
-            <w:top w:w="0" w:type="dxa"/>
-            <w:bottom w:w="0" w:type="dxa"/>
-          </w:tblCellMar>
-        </w:tblPrEx>
         <w:tc>
           <w:tcPr>
             <w:tcW w:w="2200" w:type="dxa"/>
@@ -1664,12 +1562,6 @@
         </w:tc>
       </w:tr>
       <w:tr>
-        <w:tblPrEx>
-          <w:tblCellMar>
-            <w:top w:w="0" w:type="dxa"/>
-            <w:bottom w:w="0" w:type="dxa"/>
-          </w:tblCellMar>
-        </w:tblPrEx>
         <w:tc>
           <w:tcPr>
             <w:tcW w:w="2200" w:type="dxa"/>
@@ -1756,12 +1648,6 @@
         </w:tc>
       </w:tr>
       <w:tr>
-        <w:tblPrEx>
-          <w:tblCellMar>
-            <w:top w:w="0" w:type="dxa"/>
-            <w:bottom w:w="0" w:type="dxa"/>
-          </w:tblCellMar>
-        </w:tblPrEx>
         <w:tc>
           <w:tcPr>
             <w:tcW w:w="2200" w:type="dxa"/>
@@ -1848,12 +1734,6 @@
         </w:tc>
       </w:tr>
       <w:tr>
-        <w:tblPrEx>
-          <w:tblCellMar>
-            <w:top w:w="0" w:type="dxa"/>
-            <w:bottom w:w="0" w:type="dxa"/>
-          </w:tblCellMar>
-        </w:tblPrEx>
         <w:tc>
           <w:tcPr>
             <w:tcW w:w="2200" w:type="dxa"/>
@@ -2001,12 +1881,6 @@
         <w:gridCol w:w="9360"/>
       </w:tblGrid>
       <w:tr>
-        <w:tblPrEx>
-          <w:tblCellMar>
-            <w:top w:w="0" w:type="dxa"/>
-            <w:bottom w:w="0" w:type="dxa"/>
-          </w:tblCellMar>
-        </w:tblPrEx>
         <w:tc>
           <w:tcPr>
             <w:tcW w:w="9360" w:type="dxa"/>
@@ -2153,12 +2027,6 @@
         <w:gridCol w:w="9360"/>
       </w:tblGrid>
       <w:tr>
-        <w:tblPrEx>
-          <w:tblCellMar>
-            <w:top w:w="0" w:type="dxa"/>
-            <w:bottom w:w="0" w:type="dxa"/>
-          </w:tblCellMar>
-        </w:tblPrEx>
         <w:tc>
           <w:tcPr>
             <w:tcW w:w="9360" w:type="dxa"/>
@@ -2238,12 +2106,6 @@
         <w:gridCol w:w="2872"/>
       </w:tblGrid>
       <w:tr>
-        <w:tblPrEx>
-          <w:tblCellMar>
-            <w:top w:w="0" w:type="dxa"/>
-            <w:bottom w:w="0" w:type="dxa"/>
-          </w:tblCellMar>
-        </w:tblPrEx>
         <w:tc>
           <w:tcPr>
             <w:tcW w:w="1800" w:type="dxa"/>
@@ -2336,12 +2198,6 @@
         </w:tc>
       </w:tr>
       <w:tr>
-        <w:tblPrEx>
-          <w:tblCellMar>
-            <w:top w:w="0" w:type="dxa"/>
-            <w:bottom w:w="0" w:type="dxa"/>
-          </w:tblCellMar>
-        </w:tblPrEx>
         <w:tc>
           <w:tcPr>
             <w:tcW w:w="1800" w:type="dxa"/>
@@ -2428,12 +2284,6 @@
         </w:tc>
       </w:tr>
       <w:tr>
-        <w:tblPrEx>
-          <w:tblCellMar>
-            <w:top w:w="0" w:type="dxa"/>
-            <w:bottom w:w="0" w:type="dxa"/>
-          </w:tblCellMar>
-        </w:tblPrEx>
         <w:tc>
           <w:tcPr>
             <w:tcW w:w="1800" w:type="dxa"/>
@@ -2520,12 +2370,6 @@
         </w:tc>
       </w:tr>
       <w:tr>
-        <w:tblPrEx>
-          <w:tblCellMar>
-            <w:top w:w="0" w:type="dxa"/>
-            <w:bottom w:w="0" w:type="dxa"/>
-          </w:tblCellMar>
-        </w:tblPrEx>
         <w:tc>
           <w:tcPr>
             <w:tcW w:w="1800" w:type="dxa"/>
@@ -2612,12 +2456,6 @@
         </w:tc>
       </w:tr>
       <w:tr>
-        <w:tblPrEx>
-          <w:tblCellMar>
-            <w:top w:w="0" w:type="dxa"/>
-            <w:bottom w:w="0" w:type="dxa"/>
-          </w:tblCellMar>
-        </w:tblPrEx>
         <w:tc>
           <w:tcPr>
             <w:tcW w:w="1800" w:type="dxa"/>
@@ -2730,12 +2568,6 @@
         <w:gridCol w:w="9360"/>
       </w:tblGrid>
       <w:tr>
-        <w:tblPrEx>
-          <w:tblCellMar>
-            <w:top w:w="0" w:type="dxa"/>
-            <w:bottom w:w="0" w:type="dxa"/>
-          </w:tblCellMar>
-        </w:tblPrEx>
         <w:tc>
           <w:tcPr>
             <w:tcW w:w="9360" w:type="dxa"/>
@@ -2812,12 +2644,6 @@
         <w:gridCol w:w="9360"/>
       </w:tblGrid>
       <w:tr>
-        <w:tblPrEx>
-          <w:tblCellMar>
-            <w:top w:w="0" w:type="dxa"/>
-            <w:bottom w:w="0" w:type="dxa"/>
-          </w:tblCellMar>
-        </w:tblPrEx>
         <w:tc>
           <w:tcPr>
             <w:tcW w:w="9360" w:type="dxa"/>
@@ -2936,12 +2762,6 @@
         <w:gridCol w:w="9360"/>
       </w:tblGrid>
       <w:tr>
-        <w:tblPrEx>
-          <w:tblCellMar>
-            <w:top w:w="0" w:type="dxa"/>
-            <w:bottom w:w="0" w:type="dxa"/>
-          </w:tblCellMar>
-        </w:tblPrEx>
         <w:tc>
           <w:tcPr>
             <w:tcW w:w="9360" w:type="dxa"/>
@@ -3146,12 +2966,6 @@
         <w:gridCol w:w="9360"/>
       </w:tblGrid>
       <w:tr>
-        <w:tblPrEx>
-          <w:tblCellMar>
-            <w:top w:w="0" w:type="dxa"/>
-            <w:bottom w:w="0" w:type="dxa"/>
-          </w:tblCellMar>
-        </w:tblPrEx>
         <w:tc>
           <w:tcPr>
             <w:tcW w:w="9360" w:type="dxa"/>
@@ -3318,12 +3132,6 @@
         <w:gridCol w:w="9360"/>
       </w:tblGrid>
       <w:tr>
-        <w:tblPrEx>
-          <w:tblCellMar>
-            <w:top w:w="0" w:type="dxa"/>
-            <w:bottom w:w="0" w:type="dxa"/>
-          </w:tblCellMar>
-        </w:tblPrEx>
         <w:tc>
           <w:tcPr>
             <w:tcW w:w="9360" w:type="dxa"/>
@@ -3401,12 +3209,6 @@
         <w:gridCol w:w="9360"/>
       </w:tblGrid>
       <w:tr>
-        <w:tblPrEx>
-          <w:tblCellMar>
-            <w:top w:w="0" w:type="dxa"/>
-            <w:bottom w:w="0" w:type="dxa"/>
-          </w:tblCellMar>
-        </w:tblPrEx>
         <w:tc>
           <w:tcPr>
             <w:tcW w:w="9360" w:type="dxa"/>
@@ -3814,12 +3616,6 @@
         <w:gridCol w:w="9360"/>
       </w:tblGrid>
       <w:tr>
-        <w:tblPrEx>
-          <w:tblCellMar>
-            <w:top w:w="0" w:type="dxa"/>
-            <w:bottom w:w="0" w:type="dxa"/>
-          </w:tblCellMar>
-        </w:tblPrEx>
         <w:tc>
           <w:tcPr>
             <w:tcW w:w="9360" w:type="dxa"/>
@@ -4205,12 +4001,6 @@
         <w:gridCol w:w="9360"/>
       </w:tblGrid>
       <w:tr>
-        <w:tblPrEx>
-          <w:tblCellMar>
-            <w:top w:w="0" w:type="dxa"/>
-            <w:bottom w:w="0" w:type="dxa"/>
-          </w:tblCellMar>
-        </w:tblPrEx>
         <w:tc>
           <w:tcPr>
             <w:tcW w:w="9360" w:type="dxa"/>
@@ -4324,12 +4114,6 @@
         <w:gridCol w:w="8581"/>
       </w:tblGrid>
       <w:tr>
-        <w:tblPrEx>
-          <w:tblCellMar>
-            <w:top w:w="0" w:type="dxa"/>
-            <w:bottom w:w="0" w:type="dxa"/>
-          </w:tblCellMar>
-        </w:tblPrEx>
         <w:tc>
           <w:tcPr>
             <w:tcW w:w="520" w:type="dxa"/>
@@ -4483,12 +4267,6 @@
         <w:gridCol w:w="8581"/>
       </w:tblGrid>
       <w:tr>
-        <w:tblPrEx>
-          <w:tblCellMar>
-            <w:top w:w="0" w:type="dxa"/>
-            <w:bottom w:w="0" w:type="dxa"/>
-          </w:tblCellMar>
-        </w:tblPrEx>
         <w:tc>
           <w:tcPr>
             <w:tcW w:w="520" w:type="dxa"/>
@@ -4650,12 +4428,6 @@
         <w:gridCol w:w="8581"/>
       </w:tblGrid>
       <w:tr>
-        <w:tblPrEx>
-          <w:tblCellMar>
-            <w:top w:w="0" w:type="dxa"/>
-            <w:bottom w:w="0" w:type="dxa"/>
-          </w:tblCellMar>
-        </w:tblPrEx>
         <w:tc>
           <w:tcPr>
             <w:tcW w:w="520" w:type="dxa"/>
@@ -4798,12 +4570,6 @@
         <w:gridCol w:w="9360"/>
       </w:tblGrid>
       <w:tr>
-        <w:tblPrEx>
-          <w:tblCellMar>
-            <w:top w:w="0" w:type="dxa"/>
-            <w:bottom w:w="0" w:type="dxa"/>
-          </w:tblCellMar>
-        </w:tblPrEx>
         <w:tc>
           <w:tcPr>
             <w:tcW w:w="9360" w:type="dxa"/>
@@ -4924,12 +4690,6 @@
         <w:gridCol w:w="9360"/>
       </w:tblGrid>
       <w:tr>
-        <w:tblPrEx>
-          <w:tblCellMar>
-            <w:top w:w="0" w:type="dxa"/>
-            <w:bottom w:w="0" w:type="dxa"/>
-          </w:tblCellMar>
-        </w:tblPrEx>
         <w:tc>
           <w:tcPr>
             <w:tcW w:w="9360" w:type="dxa"/>
@@ -5052,12 +4812,6 @@
         <w:gridCol w:w="8386"/>
       </w:tblGrid>
       <w:tr>
-        <w:tblPrEx>
-          <w:tblCellMar>
-            <w:top w:w="0" w:type="dxa"/>
-            <w:bottom w:w="0" w:type="dxa"/>
-          </w:tblCellMar>
-        </w:tblPrEx>
         <w:tc>
           <w:tcPr>
             <w:tcW w:w="520" w:type="dxa"/>
@@ -5255,12 +5009,6 @@
         <w:gridCol w:w="8386"/>
       </w:tblGrid>
       <w:tr>
-        <w:tblPrEx>
-          <w:tblCellMar>
-            <w:top w:w="0" w:type="dxa"/>
-            <w:bottom w:w="0" w:type="dxa"/>
-          </w:tblCellMar>
-        </w:tblPrEx>
         <w:tc>
           <w:tcPr>
             <w:tcW w:w="520" w:type="dxa"/>
@@ -5440,12 +5188,6 @@
         <w:gridCol w:w="8658"/>
       </w:tblGrid>
       <w:tr>
-        <w:tblPrEx>
-          <w:tblCellMar>
-            <w:top w:w="0" w:type="dxa"/>
-            <w:bottom w:w="0" w:type="dxa"/>
-          </w:tblCellMar>
-        </w:tblPrEx>
         <w:tc>
           <w:tcPr>
             <w:tcW w:w="520" w:type="dxa"/>
@@ -5589,12 +5331,6 @@
         <w:gridCol w:w="8386"/>
       </w:tblGrid>
       <w:tr>
-        <w:tblPrEx>
-          <w:tblCellMar>
-            <w:top w:w="0" w:type="dxa"/>
-            <w:bottom w:w="0" w:type="dxa"/>
-          </w:tblCellMar>
-        </w:tblPrEx>
         <w:tc>
           <w:tcPr>
             <w:tcW w:w="520" w:type="dxa"/>
@@ -5775,12 +5511,6 @@
         <w:gridCol w:w="6360"/>
       </w:tblGrid>
       <w:tr>
-        <w:tblPrEx>
-          <w:tblCellMar>
-            <w:top w:w="0" w:type="dxa"/>
-            <w:bottom w:w="0" w:type="dxa"/>
-          </w:tblCellMar>
-        </w:tblPrEx>
         <w:tc>
           <w:tcPr>
             <w:tcW w:w="3000" w:type="dxa"/>
@@ -5843,12 +5573,6 @@
         </w:tc>
       </w:tr>
       <w:tr>
-        <w:tblPrEx>
-          <w:tblCellMar>
-            <w:top w:w="0" w:type="dxa"/>
-            <w:bottom w:w="0" w:type="dxa"/>
-          </w:tblCellMar>
-        </w:tblPrEx>
         <w:tc>
           <w:tcPr>
             <w:tcW w:w="3000" w:type="dxa"/>
@@ -5927,12 +5651,6 @@
         </w:tc>
       </w:tr>
       <w:tr>
-        <w:tblPrEx>
-          <w:tblCellMar>
-            <w:top w:w="0" w:type="dxa"/>
-            <w:bottom w:w="0" w:type="dxa"/>
-          </w:tblCellMar>
-        </w:tblPrEx>
         <w:tc>
           <w:tcPr>
             <w:tcW w:w="3000" w:type="dxa"/>
@@ -6029,12 +5747,6 @@
         </w:tc>
       </w:tr>
       <w:tr>
-        <w:tblPrEx>
-          <w:tblCellMar>
-            <w:top w:w="0" w:type="dxa"/>
-            <w:bottom w:w="0" w:type="dxa"/>
-          </w:tblCellMar>
-        </w:tblPrEx>
         <w:tc>
           <w:tcPr>
             <w:tcW w:w="3000" w:type="dxa"/>
@@ -6145,12 +5857,6 @@
         <w:gridCol w:w="9360"/>
       </w:tblGrid>
       <w:tr>
-        <w:tblPrEx>
-          <w:tblCellMar>
-            <w:top w:w="0" w:type="dxa"/>
-            <w:bottom w:w="0" w:type="dxa"/>
-          </w:tblCellMar>
-        </w:tblPrEx>
         <w:tc>
           <w:tcPr>
             <w:tcW w:w="9360" w:type="dxa"/>
@@ -6351,14 +6057,109 @@
             </w:r>
           </w:p>
           <w:p>
-            <w:r>
-              <w:rPr>
-                <w:rFonts w:ascii="Courier New" w:eastAsia="Courier New" w:hAnsi="Courier New" w:cs="Courier New"/>
-                <w:color w:val="D4D4D4"/>
-                <w:sz w:val="18"/>
-                <w:szCs w:val="18"/>
-              </w:rPr>
-              <w:t>done</w:t>
+            <w:pPr>
+              <w:rPr>
+                <w:rFonts w:ascii="Courier New" w:eastAsia="Courier New" w:hAnsi="Courier New" w:cs="Courier New"/>
+                <w:color w:val="D4D4D4"/>
+                <w:sz w:val="18"/>
+                <w:szCs w:val="18"/>
+              </w:rPr>
+            </w:pPr>
+            <w:r>
+              <w:rPr>
+                <w:rFonts w:ascii="Courier New" w:eastAsia="Courier New" w:hAnsi="Courier New" w:cs="Courier New"/>
+                <w:color w:val="D4D4D4"/>
+                <w:sz w:val="18"/>
+                <w:szCs w:val="18"/>
+              </w:rPr>
+              <w:t>d</w:t>
+            </w:r>
+            <w:r>
+              <w:rPr>
+                <w:rFonts w:ascii="Courier New" w:eastAsia="Courier New" w:hAnsi="Courier New" w:cs="Courier New"/>
+                <w:color w:val="D4D4D4"/>
+                <w:sz w:val="18"/>
+                <w:szCs w:val="18"/>
+              </w:rPr>
+              <w:t>one</w:t>
+            </w:r>
+          </w:p>
+          <w:p>
+            <w:pPr>
+              <w:rPr>
+                <w:rFonts w:ascii="Courier New" w:eastAsia="Courier New" w:hAnsi="Courier New" w:cs="Courier New"/>
+                <w:color w:val="D4D4D4"/>
+                <w:sz w:val="18"/>
+                <w:szCs w:val="18"/>
+              </w:rPr>
+            </w:pPr>
+          </w:p>
+          <w:p>
+            <w:r>
+              <w:t>for ($</w:t>
+            </w:r>
+            <w:proofErr w:type="spellStart"/>
+            <w:r>
+              <w:t>i</w:t>
+            </w:r>
+            <w:proofErr w:type="spellEnd"/>
+            <w:r>
+              <w:t xml:space="preserve"> = 1; $</w:t>
+            </w:r>
+            <w:proofErr w:type="spellStart"/>
+            <w:r>
+              <w:t>i</w:t>
+            </w:r>
+            <w:proofErr w:type="spellEnd"/>
+            <w:r>
+              <w:t xml:space="preserve"> -le 5; $</w:t>
+            </w:r>
+            <w:proofErr w:type="spellStart"/>
+            <w:r>
+              <w:t>i</w:t>
+            </w:r>
+            <w:proofErr w:type="spellEnd"/>
+            <w:r>
+              <w:t>++) {</w:t>
+            </w:r>
+          </w:p>
+          <w:p>
+            <w:r>
+              <w:t xml:space="preserve">    $port = 9400 + ($</w:t>
+            </w:r>
+            <w:proofErr w:type="spellStart"/>
+            <w:r>
+              <w:t>i</w:t>
+            </w:r>
+            <w:proofErr w:type="spellEnd"/>
+            <w:r>
+              <w:t xml:space="preserve"> - 1)</w:t>
+            </w:r>
+          </w:p>
+          <w:p>
+            <w:r>
+              <w:t xml:space="preserve">     docker exec "lab07-node$i" /lab07/raft/</w:t>
+            </w:r>
+            <w:proofErr w:type="spellStart"/>
+            <w:r>
+              <w:t>raft_bin</w:t>
+            </w:r>
+            <w:proofErr w:type="spellEnd"/>
+            <w:r>
+              <w:t xml:space="preserve"> -mode client -node "raft-node${</w:t>
+            </w:r>
+            <w:proofErr w:type="spellStart"/>
+            <w:r>
+              <w:t>i</w:t>
+            </w:r>
+            <w:proofErr w:type="spellEnd"/>
+            <w:r>
+              <w:t>}:${port}" -status</w:t>
+            </w:r>
+          </w:p>
+          <w:p>
+            <w:r>
+              <w:t xml:space="preserve"> }</w:t>
             </w:r>
           </w:p>
         </w:tc>
@@ -6414,12 +6215,6 @@
         <w:gridCol w:w="9360"/>
       </w:tblGrid>
       <w:tr>
-        <w:tblPrEx>
-          <w:tblCellMar>
-            <w:top w:w="0" w:type="dxa"/>
-            <w:bottom w:w="0" w:type="dxa"/>
-          </w:tblCellMar>
-        </w:tblPrEx>
         <w:tc>
           <w:tcPr>
             <w:tcW w:w="9360" w:type="dxa"/>
@@ -6542,12 +6337,6 @@
         <w:gridCol w:w="8658"/>
       </w:tblGrid>
       <w:tr>
-        <w:tblPrEx>
-          <w:tblCellMar>
-            <w:top w:w="0" w:type="dxa"/>
-            <w:bottom w:w="0" w:type="dxa"/>
-          </w:tblCellMar>
-        </w:tblPrEx>
         <w:tc>
           <w:tcPr>
             <w:tcW w:w="520" w:type="dxa"/>
@@ -6709,12 +6498,6 @@
         <w:gridCol w:w="8658"/>
       </w:tblGrid>
       <w:tr>
-        <w:tblPrEx>
-          <w:tblCellMar>
-            <w:top w:w="0" w:type="dxa"/>
-            <w:bottom w:w="0" w:type="dxa"/>
-          </w:tblCellMar>
-        </w:tblPrEx>
         <w:tc>
           <w:tcPr>
             <w:tcW w:w="520" w:type="dxa"/>
@@ -6876,12 +6659,6 @@
         <w:gridCol w:w="8658"/>
       </w:tblGrid>
       <w:tr>
-        <w:tblPrEx>
-          <w:tblCellMar>
-            <w:top w:w="0" w:type="dxa"/>
-            <w:bottom w:w="0" w:type="dxa"/>
-          </w:tblCellMar>
-        </w:tblPrEx>
         <w:tc>
           <w:tcPr>
             <w:tcW w:w="520" w:type="dxa"/>
@@ -7035,12 +6812,6 @@
         <w:gridCol w:w="8658"/>
       </w:tblGrid>
       <w:tr>
-        <w:tblPrEx>
-          <w:tblCellMar>
-            <w:top w:w="0" w:type="dxa"/>
-            <w:bottom w:w="0" w:type="dxa"/>
-          </w:tblCellMar>
-        </w:tblPrEx>
         <w:tc>
           <w:tcPr>
             <w:tcW w:w="520" w:type="dxa"/>
@@ -7219,12 +6990,6 @@
         <w:gridCol w:w="9360"/>
       </w:tblGrid>
       <w:tr>
-        <w:tblPrEx>
-          <w:tblCellMar>
-            <w:top w:w="0" w:type="dxa"/>
-            <w:bottom w:w="0" w:type="dxa"/>
-          </w:tblCellMar>
-        </w:tblPrEx>
         <w:tc>
           <w:tcPr>
             <w:tcW w:w="9360" w:type="dxa"/>
@@ -7609,12 +7374,6 @@
         <w:gridCol w:w="9360"/>
       </w:tblGrid>
       <w:tr>
-        <w:tblPrEx>
-          <w:tblCellMar>
-            <w:top w:w="0" w:type="dxa"/>
-            <w:bottom w:w="0" w:type="dxa"/>
-          </w:tblCellMar>
-        </w:tblPrEx>
         <w:tc>
           <w:tcPr>
             <w:tcW w:w="9360" w:type="dxa"/>
@@ -7998,12 +7757,6 @@
         <w:gridCol w:w="9360"/>
       </w:tblGrid>
       <w:tr>
-        <w:tblPrEx>
-          <w:tblCellMar>
-            <w:top w:w="0" w:type="dxa"/>
-            <w:bottom w:w="0" w:type="dxa"/>
-          </w:tblCellMar>
-        </w:tblPrEx>
         <w:tc>
           <w:tcPr>
             <w:tcW w:w="9360" w:type="dxa"/>
@@ -8095,12 +7848,6 @@
         <w:gridCol w:w="8590"/>
       </w:tblGrid>
       <w:tr>
-        <w:tblPrEx>
-          <w:tblCellMar>
-            <w:top w:w="0" w:type="dxa"/>
-            <w:bottom w:w="0" w:type="dxa"/>
-          </w:tblCellMar>
-        </w:tblPrEx>
         <w:tc>
           <w:tcPr>
             <w:tcW w:w="520" w:type="dxa"/>
@@ -8280,12 +8027,6 @@
         <w:gridCol w:w="8590"/>
       </w:tblGrid>
       <w:tr>
-        <w:tblPrEx>
-          <w:tblCellMar>
-            <w:top w:w="0" w:type="dxa"/>
-            <w:bottom w:w="0" w:type="dxa"/>
-          </w:tblCellMar>
-        </w:tblPrEx>
         <w:tc>
           <w:tcPr>
             <w:tcW w:w="520" w:type="dxa"/>
@@ -8447,12 +8188,6 @@
         <w:gridCol w:w="8590"/>
       </w:tblGrid>
       <w:tr>
-        <w:tblPrEx>
-          <w:tblCellMar>
-            <w:top w:w="0" w:type="dxa"/>
-            <w:bottom w:w="0" w:type="dxa"/>
-          </w:tblCellMar>
-        </w:tblPrEx>
         <w:tc>
           <w:tcPr>
             <w:tcW w:w="520" w:type="dxa"/>
@@ -8607,12 +8342,6 @@
         <w:gridCol w:w="9360"/>
       </w:tblGrid>
       <w:tr>
-        <w:tblPrEx>
-          <w:tblCellMar>
-            <w:top w:w="0" w:type="dxa"/>
-            <w:bottom w:w="0" w:type="dxa"/>
-          </w:tblCellMar>
-        </w:tblPrEx>
         <w:tc>
           <w:tcPr>
             <w:tcW w:w="9360" w:type="dxa"/>
@@ -8682,12 +8411,6 @@
         <w:gridCol w:w="9360"/>
       </w:tblGrid>
       <w:tr>
-        <w:tblPrEx>
-          <w:tblCellMar>
-            <w:top w:w="0" w:type="dxa"/>
-            <w:bottom w:w="0" w:type="dxa"/>
-          </w:tblCellMar>
-        </w:tblPrEx>
         <w:tc>
           <w:tcPr>
             <w:tcW w:w="9360" w:type="dxa"/>
@@ -8720,12 +8443,6 @@
         </w:tc>
       </w:tr>
       <w:tr>
-        <w:tblPrEx>
-          <w:tblCellMar>
-            <w:top w:w="0" w:type="dxa"/>
-            <w:bottom w:w="0" w:type="dxa"/>
-          </w:tblCellMar>
-        </w:tblPrEx>
         <w:tc>
           <w:tcPr>
             <w:tcW w:w="9360" w:type="dxa"/>
@@ -8940,12 +8657,6 @@
         <w:gridCol w:w="9360"/>
       </w:tblGrid>
       <w:tr>
-        <w:tblPrEx>
-          <w:tblCellMar>
-            <w:top w:w="0" w:type="dxa"/>
-            <w:bottom w:w="0" w:type="dxa"/>
-          </w:tblCellMar>
-        </w:tblPrEx>
         <w:tc>
           <w:tcPr>
             <w:tcW w:w="9360" w:type="dxa"/>
@@ -8978,12 +8689,6 @@
         </w:tc>
       </w:tr>
       <w:tr>
-        <w:tblPrEx>
-          <w:tblCellMar>
-            <w:top w:w="0" w:type="dxa"/>
-            <w:bottom w:w="0" w:type="dxa"/>
-          </w:tblCellMar>
-        </w:tblPrEx>
         <w:tc>
           <w:tcPr>
             <w:tcW w:w="9360" w:type="dxa"/>
@@ -9212,12 +8917,6 @@
         <w:gridCol w:w="9360"/>
       </w:tblGrid>
       <w:tr>
-        <w:tblPrEx>
-          <w:tblCellMar>
-            <w:top w:w="0" w:type="dxa"/>
-            <w:bottom w:w="0" w:type="dxa"/>
-          </w:tblCellMar>
-        </w:tblPrEx>
         <w:tc>
           <w:tcPr>
             <w:tcW w:w="9360" w:type="dxa"/>
@@ -9250,12 +8949,6 @@
         </w:tc>
       </w:tr>
       <w:tr>
-        <w:tblPrEx>
-          <w:tblCellMar>
-            <w:top w:w="0" w:type="dxa"/>
-            <w:bottom w:w="0" w:type="dxa"/>
-          </w:tblCellMar>
-        </w:tblPrEx>
         <w:tc>
           <w:tcPr>
             <w:tcW w:w="9360" w:type="dxa"/>
@@ -9472,12 +9165,6 @@
         <w:gridCol w:w="9360"/>
       </w:tblGrid>
       <w:tr>
-        <w:tblPrEx>
-          <w:tblCellMar>
-            <w:top w:w="0" w:type="dxa"/>
-            <w:bottom w:w="0" w:type="dxa"/>
-          </w:tblCellMar>
-        </w:tblPrEx>
         <w:tc>
           <w:tcPr>
             <w:tcW w:w="9360" w:type="dxa"/>
@@ -9510,12 +9197,6 @@
         </w:tc>
       </w:tr>
       <w:tr>
-        <w:tblPrEx>
-          <w:tblCellMar>
-            <w:top w:w="0" w:type="dxa"/>
-            <w:bottom w:w="0" w:type="dxa"/>
-          </w:tblCellMar>
-        </w:tblPrEx>
         <w:tc>
           <w:tcPr>
             <w:tcW w:w="9360" w:type="dxa"/>
@@ -9701,12 +9382,6 @@
         <w:gridCol w:w="9360"/>
       </w:tblGrid>
       <w:tr>
-        <w:tblPrEx>
-          <w:tblCellMar>
-            <w:top w:w="0" w:type="dxa"/>
-            <w:bottom w:w="0" w:type="dxa"/>
-          </w:tblCellMar>
-        </w:tblPrEx>
         <w:tc>
           <w:tcPr>
             <w:tcW w:w="9360" w:type="dxa"/>
@@ -9739,12 +9414,6 @@
         </w:tc>
       </w:tr>
       <w:tr>
-        <w:tblPrEx>
-          <w:tblCellMar>
-            <w:top w:w="0" w:type="dxa"/>
-            <w:bottom w:w="0" w:type="dxa"/>
-          </w:tblCellMar>
-        </w:tblPrEx>
         <w:tc>
           <w:tcPr>
             <w:tcW w:w="9360" w:type="dxa"/>
@@ -10011,12 +9680,6 @@
         <w:gridCol w:w="9360"/>
       </w:tblGrid>
       <w:tr>
-        <w:tblPrEx>
-          <w:tblCellMar>
-            <w:top w:w="0" w:type="dxa"/>
-            <w:bottom w:w="0" w:type="dxa"/>
-          </w:tblCellMar>
-        </w:tblPrEx>
         <w:tc>
           <w:tcPr>
             <w:tcW w:w="9360" w:type="dxa"/>
@@ -10046,12 +9709,6 @@
         </w:tc>
       </w:tr>
       <w:tr>
-        <w:tblPrEx>
-          <w:tblCellMar>
-            <w:top w:w="0" w:type="dxa"/>
-            <w:bottom w:w="0" w:type="dxa"/>
-          </w:tblCellMar>
-        </w:tblPrEx>
         <w:tc>
           <w:tcPr>
             <w:tcW w:w="9360" w:type="dxa"/>
@@ -10080,12 +9737,6 @@
         </w:tc>
       </w:tr>
       <w:tr>
-        <w:tblPrEx>
-          <w:tblCellMar>
-            <w:top w:w="0" w:type="dxa"/>
-            <w:bottom w:w="0" w:type="dxa"/>
-          </w:tblCellMar>
-        </w:tblPrEx>
         <w:tc>
           <w:tcPr>
             <w:tcW w:w="9360" w:type="dxa"/>
@@ -10114,12 +9765,6 @@
         </w:tc>
       </w:tr>
       <w:tr>
-        <w:tblPrEx>
-          <w:tblCellMar>
-            <w:top w:w="0" w:type="dxa"/>
-            <w:bottom w:w="0" w:type="dxa"/>
-          </w:tblCellMar>
-        </w:tblPrEx>
         <w:tc>
           <w:tcPr>
             <w:tcW w:w="9360" w:type="dxa"/>
@@ -10148,12 +9793,6 @@
         </w:tc>
       </w:tr>
       <w:tr>
-        <w:tblPrEx>
-          <w:tblCellMar>
-            <w:top w:w="0" w:type="dxa"/>
-            <w:bottom w:w="0" w:type="dxa"/>
-          </w:tblCellMar>
-        </w:tblPrEx>
         <w:tc>
           <w:tcPr>
             <w:tcW w:w="9360" w:type="dxa"/>
@@ -10182,12 +9821,6 @@
         </w:tc>
       </w:tr>
       <w:tr>
-        <w:tblPrEx>
-          <w:tblCellMar>
-            <w:top w:w="0" w:type="dxa"/>
-            <w:bottom w:w="0" w:type="dxa"/>
-          </w:tblCellMar>
-        </w:tblPrEx>
         <w:tc>
           <w:tcPr>
             <w:tcW w:w="9360" w:type="dxa"/>
@@ -10278,12 +9911,6 @@
         <w:gridCol w:w="9360"/>
       </w:tblGrid>
       <w:tr>
-        <w:tblPrEx>
-          <w:tblCellMar>
-            <w:top w:w="0" w:type="dxa"/>
-            <w:bottom w:w="0" w:type="dxa"/>
-          </w:tblCellMar>
-        </w:tblPrEx>
         <w:tc>
           <w:tcPr>
             <w:tcW w:w="9360" w:type="dxa"/>
@@ -10313,12 +9940,6 @@
         </w:tc>
       </w:tr>
       <w:tr>
-        <w:tblPrEx>
-          <w:tblCellMar>
-            <w:top w:w="0" w:type="dxa"/>
-            <w:bottom w:w="0" w:type="dxa"/>
-          </w:tblCellMar>
-        </w:tblPrEx>
         <w:tc>
           <w:tcPr>
             <w:tcW w:w="9360" w:type="dxa"/>
@@ -10347,12 +9968,6 @@
         </w:tc>
       </w:tr>
       <w:tr>
-        <w:tblPrEx>
-          <w:tblCellMar>
-            <w:top w:w="0" w:type="dxa"/>
-            <w:bottom w:w="0" w:type="dxa"/>
-          </w:tblCellMar>
-        </w:tblPrEx>
         <w:tc>
           <w:tcPr>
             <w:tcW w:w="9360" w:type="dxa"/>
@@ -10381,12 +9996,6 @@
         </w:tc>
       </w:tr>
       <w:tr>
-        <w:tblPrEx>
-          <w:tblCellMar>
-            <w:top w:w="0" w:type="dxa"/>
-            <w:bottom w:w="0" w:type="dxa"/>
-          </w:tblCellMar>
-        </w:tblPrEx>
         <w:tc>
           <w:tcPr>
             <w:tcW w:w="9360" w:type="dxa"/>
@@ -10415,12 +10024,6 @@
         </w:tc>
       </w:tr>
       <w:tr>
-        <w:tblPrEx>
-          <w:tblCellMar>
-            <w:top w:w="0" w:type="dxa"/>
-            <w:bottom w:w="0" w:type="dxa"/>
-          </w:tblCellMar>
-        </w:tblPrEx>
         <w:tc>
           <w:tcPr>
             <w:tcW w:w="9360" w:type="dxa"/>
@@ -10449,12 +10052,6 @@
         </w:tc>
       </w:tr>
       <w:tr>
-        <w:tblPrEx>
-          <w:tblCellMar>
-            <w:top w:w="0" w:type="dxa"/>
-            <w:bottom w:w="0" w:type="dxa"/>
-          </w:tblCellMar>
-        </w:tblPrEx>
         <w:tc>
           <w:tcPr>
             <w:tcW w:w="9360" w:type="dxa"/>
@@ -10531,12 +10128,6 @@
         <w:gridCol w:w="9360"/>
       </w:tblGrid>
       <w:tr>
-        <w:tblPrEx>
-          <w:tblCellMar>
-            <w:top w:w="0" w:type="dxa"/>
-            <w:bottom w:w="0" w:type="dxa"/>
-          </w:tblCellMar>
-        </w:tblPrEx>
         <w:tc>
           <w:tcPr>
             <w:tcW w:w="9360" w:type="dxa"/>
@@ -10566,12 +10157,6 @@
         </w:tc>
       </w:tr>
       <w:tr>
-        <w:tblPrEx>
-          <w:tblCellMar>
-            <w:top w:w="0" w:type="dxa"/>
-            <w:bottom w:w="0" w:type="dxa"/>
-          </w:tblCellMar>
-        </w:tblPrEx>
         <w:tc>
           <w:tcPr>
             <w:tcW w:w="9360" w:type="dxa"/>
@@ -10600,12 +10185,6 @@
         </w:tc>
       </w:tr>
       <w:tr>
-        <w:tblPrEx>
-          <w:tblCellMar>
-            <w:top w:w="0" w:type="dxa"/>
-            <w:bottom w:w="0" w:type="dxa"/>
-          </w:tblCellMar>
-        </w:tblPrEx>
         <w:tc>
           <w:tcPr>
             <w:tcW w:w="9360" w:type="dxa"/>
@@ -10634,12 +10213,6 @@
         </w:tc>
       </w:tr>
       <w:tr>
-        <w:tblPrEx>
-          <w:tblCellMar>
-            <w:top w:w="0" w:type="dxa"/>
-            <w:bottom w:w="0" w:type="dxa"/>
-          </w:tblCellMar>
-        </w:tblPrEx>
         <w:tc>
           <w:tcPr>
             <w:tcW w:w="9360" w:type="dxa"/>
@@ -10668,12 +10241,6 @@
         </w:tc>
       </w:tr>
       <w:tr>
-        <w:tblPrEx>
-          <w:tblCellMar>
-            <w:top w:w="0" w:type="dxa"/>
-            <w:bottom w:w="0" w:type="dxa"/>
-          </w:tblCellMar>
-        </w:tblPrEx>
         <w:tc>
           <w:tcPr>
             <w:tcW w:w="9360" w:type="dxa"/>
@@ -10702,12 +10269,6 @@
         </w:tc>
       </w:tr>
       <w:tr>
-        <w:tblPrEx>
-          <w:tblCellMar>
-            <w:top w:w="0" w:type="dxa"/>
-            <w:bottom w:w="0" w:type="dxa"/>
-          </w:tblCellMar>
-        </w:tblPrEx>
         <w:tc>
           <w:tcPr>
             <w:tcW w:w="9360" w:type="dxa"/>
@@ -10784,12 +10345,6 @@
         <w:gridCol w:w="9360"/>
       </w:tblGrid>
       <w:tr>
-        <w:tblPrEx>
-          <w:tblCellMar>
-            <w:top w:w="0" w:type="dxa"/>
-            <w:bottom w:w="0" w:type="dxa"/>
-          </w:tblCellMar>
-        </w:tblPrEx>
         <w:tc>
           <w:tcPr>
             <w:tcW w:w="9360" w:type="dxa"/>
@@ -10819,12 +10374,6 @@
         </w:tc>
       </w:tr>
       <w:tr>
-        <w:tblPrEx>
-          <w:tblCellMar>
-            <w:top w:w="0" w:type="dxa"/>
-            <w:bottom w:w="0" w:type="dxa"/>
-          </w:tblCellMar>
-        </w:tblPrEx>
         <w:tc>
           <w:tcPr>
             <w:tcW w:w="9360" w:type="dxa"/>
@@ -10853,12 +10402,6 @@
         </w:tc>
       </w:tr>
       <w:tr>
-        <w:tblPrEx>
-          <w:tblCellMar>
-            <w:top w:w="0" w:type="dxa"/>
-            <w:bottom w:w="0" w:type="dxa"/>
-          </w:tblCellMar>
-        </w:tblPrEx>
         <w:tc>
           <w:tcPr>
             <w:tcW w:w="9360" w:type="dxa"/>
@@ -10887,12 +10430,6 @@
         </w:tc>
       </w:tr>
       <w:tr>
-        <w:tblPrEx>
-          <w:tblCellMar>
-            <w:top w:w="0" w:type="dxa"/>
-            <w:bottom w:w="0" w:type="dxa"/>
-          </w:tblCellMar>
-        </w:tblPrEx>
         <w:tc>
           <w:tcPr>
             <w:tcW w:w="9360" w:type="dxa"/>
@@ -10921,12 +10458,6 @@
         </w:tc>
       </w:tr>
       <w:tr>
-        <w:tblPrEx>
-          <w:tblCellMar>
-            <w:top w:w="0" w:type="dxa"/>
-            <w:bottom w:w="0" w:type="dxa"/>
-          </w:tblCellMar>
-        </w:tblPrEx>
         <w:tc>
           <w:tcPr>
             <w:tcW w:w="9360" w:type="dxa"/>
@@ -10956,12 +10487,6 @@
         </w:tc>
       </w:tr>
       <w:tr>
-        <w:tblPrEx>
-          <w:tblCellMar>
-            <w:top w:w="0" w:type="dxa"/>
-            <w:bottom w:w="0" w:type="dxa"/>
-          </w:tblCellMar>
-        </w:tblPrEx>
         <w:tc>
           <w:tcPr>
             <w:tcW w:w="9360" w:type="dxa"/>
@@ -11038,12 +10563,6 @@
         <w:gridCol w:w="3960"/>
       </w:tblGrid>
       <w:tr>
-        <w:tblPrEx>
-          <w:tblCellMar>
-            <w:top w:w="0" w:type="dxa"/>
-            <w:bottom w:w="0" w:type="dxa"/>
-          </w:tblCellMar>
-        </w:tblPrEx>
         <w:tc>
           <w:tcPr>
             <w:tcW w:w="5400" w:type="dxa"/>
@@ -11106,12 +10625,6 @@
         </w:tc>
       </w:tr>
       <w:tr>
-        <w:tblPrEx>
-          <w:tblCellMar>
-            <w:top w:w="0" w:type="dxa"/>
-            <w:bottom w:w="0" w:type="dxa"/>
-          </w:tblCellMar>
-        </w:tblPrEx>
         <w:tc>
           <w:tcPr>
             <w:tcW w:w="5400" w:type="dxa"/>
@@ -11161,12 +10674,6 @@
         </w:tc>
       </w:tr>
       <w:tr>
-        <w:tblPrEx>
-          <w:tblCellMar>
-            <w:top w:w="0" w:type="dxa"/>
-            <w:bottom w:w="0" w:type="dxa"/>
-          </w:tblCellMar>
-        </w:tblPrEx>
         <w:tc>
           <w:tcPr>
             <w:tcW w:w="5400" w:type="dxa"/>
@@ -11216,12 +10723,6 @@
         </w:tc>
       </w:tr>
       <w:tr>
-        <w:tblPrEx>
-          <w:tblCellMar>
-            <w:top w:w="0" w:type="dxa"/>
-            <w:bottom w:w="0" w:type="dxa"/>
-          </w:tblCellMar>
-        </w:tblPrEx>
         <w:tc>
           <w:tcPr>
             <w:tcW w:w="5400" w:type="dxa"/>
@@ -11271,12 +10772,6 @@
         </w:tc>
       </w:tr>
       <w:tr>
-        <w:tblPrEx>
-          <w:tblCellMar>
-            <w:top w:w="0" w:type="dxa"/>
-            <w:bottom w:w="0" w:type="dxa"/>
-          </w:tblCellMar>
-        </w:tblPrEx>
         <w:tc>
           <w:tcPr>
             <w:tcW w:w="5400" w:type="dxa"/>
@@ -11326,12 +10821,6 @@
         </w:tc>
       </w:tr>
       <w:tr>
-        <w:tblPrEx>
-          <w:tblCellMar>
-            <w:top w:w="0" w:type="dxa"/>
-            <w:bottom w:w="0" w:type="dxa"/>
-          </w:tblCellMar>
-        </w:tblPrEx>
         <w:tc>
           <w:tcPr>
             <w:tcW w:w="5400" w:type="dxa"/>
@@ -11416,12 +10905,6 @@
         <w:gridCol w:w="3960"/>
       </w:tblGrid>
       <w:tr>
-        <w:tblPrEx>
-          <w:tblCellMar>
-            <w:top w:w="0" w:type="dxa"/>
-            <w:bottom w:w="0" w:type="dxa"/>
-          </w:tblCellMar>
-        </w:tblPrEx>
         <w:tc>
           <w:tcPr>
             <w:tcW w:w="5400" w:type="dxa"/>
@@ -11484,12 +10967,6 @@
         </w:tc>
       </w:tr>
       <w:tr>
-        <w:tblPrEx>
-          <w:tblCellMar>
-            <w:top w:w="0" w:type="dxa"/>
-            <w:bottom w:w="0" w:type="dxa"/>
-          </w:tblCellMar>
-        </w:tblPrEx>
         <w:tc>
           <w:tcPr>
             <w:tcW w:w="5400" w:type="dxa"/>
@@ -11539,12 +11016,6 @@
         </w:tc>
       </w:tr>
       <w:tr>
-        <w:tblPrEx>
-          <w:tblCellMar>
-            <w:top w:w="0" w:type="dxa"/>
-            <w:bottom w:w="0" w:type="dxa"/>
-          </w:tblCellMar>
-        </w:tblPrEx>
         <w:tc>
           <w:tcPr>
             <w:tcW w:w="5400" w:type="dxa"/>
@@ -11594,12 +11065,6 @@
         </w:tc>
       </w:tr>
       <w:tr>
-        <w:tblPrEx>
-          <w:tblCellMar>
-            <w:top w:w="0" w:type="dxa"/>
-            <w:bottom w:w="0" w:type="dxa"/>
-          </w:tblCellMar>
-        </w:tblPrEx>
         <w:tc>
           <w:tcPr>
             <w:tcW w:w="5400" w:type="dxa"/>
@@ -11649,12 +11114,6 @@
         </w:tc>
       </w:tr>
       <w:tr>
-        <w:tblPrEx>
-          <w:tblCellMar>
-            <w:top w:w="0" w:type="dxa"/>
-            <w:bottom w:w="0" w:type="dxa"/>
-          </w:tblCellMar>
-        </w:tblPrEx>
         <w:tc>
           <w:tcPr>
             <w:tcW w:w="5400" w:type="dxa"/>
@@ -11704,12 +11163,6 @@
         </w:tc>
       </w:tr>
       <w:tr>
-        <w:tblPrEx>
-          <w:tblCellMar>
-            <w:top w:w="0" w:type="dxa"/>
-            <w:bottom w:w="0" w:type="dxa"/>
-          </w:tblCellMar>
-        </w:tblPrEx>
         <w:tc>
           <w:tcPr>
             <w:tcW w:w="5400" w:type="dxa"/>
@@ -11759,12 +11212,6 @@
         </w:tc>
       </w:tr>
       <w:tr>
-        <w:tblPrEx>
-          <w:tblCellMar>
-            <w:top w:w="0" w:type="dxa"/>
-            <w:bottom w:w="0" w:type="dxa"/>
-          </w:tblCellMar>
-        </w:tblPrEx>
         <w:tc>
           <w:tcPr>
             <w:tcW w:w="5400" w:type="dxa"/>
@@ -11854,12 +11301,6 @@
         <w:gridCol w:w="3160"/>
       </w:tblGrid>
       <w:tr>
-        <w:tblPrEx>
-          <w:tblCellMar>
-            <w:top w:w="0" w:type="dxa"/>
-            <w:bottom w:w="0" w:type="dxa"/>
-          </w:tblCellMar>
-        </w:tblPrEx>
         <w:tc>
           <w:tcPr>
             <w:tcW w:w="2800" w:type="dxa"/>
@@ -11952,12 +11393,6 @@
         </w:tc>
       </w:tr>
       <w:tr>
-        <w:tblPrEx>
-          <w:tblCellMar>
-            <w:top w:w="0" w:type="dxa"/>
-            <w:bottom w:w="0" w:type="dxa"/>
-          </w:tblCellMar>
-        </w:tblPrEx>
         <w:tc>
           <w:tcPr>
             <w:tcW w:w="2800" w:type="dxa"/>
@@ -12044,12 +11479,6 @@
         </w:tc>
       </w:tr>
       <w:tr>
-        <w:tblPrEx>
-          <w:tblCellMar>
-            <w:top w:w="0" w:type="dxa"/>
-            <w:bottom w:w="0" w:type="dxa"/>
-          </w:tblCellMar>
-        </w:tblPrEx>
         <w:tc>
           <w:tcPr>
             <w:tcW w:w="2800" w:type="dxa"/>
@@ -12180,12 +11609,6 @@
         <w:gridCol w:w="5960"/>
       </w:tblGrid>
       <w:tr>
-        <w:tblPrEx>
-          <w:tblCellMar>
-            <w:top w:w="0" w:type="dxa"/>
-            <w:bottom w:w="0" w:type="dxa"/>
-          </w:tblCellMar>
-        </w:tblPrEx>
         <w:tc>
           <w:tcPr>
             <w:tcW w:w="3400" w:type="dxa"/>
@@ -12248,12 +11671,6 @@
         </w:tc>
       </w:tr>
       <w:tr>
-        <w:tblPrEx>
-          <w:tblCellMar>
-            <w:top w:w="0" w:type="dxa"/>
-            <w:bottom w:w="0" w:type="dxa"/>
-          </w:tblCellMar>
-        </w:tblPrEx>
         <w:tc>
           <w:tcPr>
             <w:tcW w:w="3400" w:type="dxa"/>
@@ -12322,12 +11739,6 @@
         </w:tc>
       </w:tr>
       <w:tr>
-        <w:tblPrEx>
-          <w:tblCellMar>
-            <w:top w:w="0" w:type="dxa"/>
-            <w:bottom w:w="0" w:type="dxa"/>
-          </w:tblCellMar>
-        </w:tblPrEx>
         <w:tc>
           <w:tcPr>
             <w:tcW w:w="3400" w:type="dxa"/>
@@ -12414,12 +11825,6 @@
         </w:tc>
       </w:tr>
       <w:tr>
-        <w:tblPrEx>
-          <w:tblCellMar>
-            <w:top w:w="0" w:type="dxa"/>
-            <w:bottom w:w="0" w:type="dxa"/>
-          </w:tblCellMar>
-        </w:tblPrEx>
         <w:tc>
           <w:tcPr>
             <w:tcW w:w="3400" w:type="dxa"/>
@@ -12488,12 +11893,6 @@
         </w:tc>
       </w:tr>
       <w:tr>
-        <w:tblPrEx>
-          <w:tblCellMar>
-            <w:top w:w="0" w:type="dxa"/>
-            <w:bottom w:w="0" w:type="dxa"/>
-          </w:tblCellMar>
-        </w:tblPrEx>
         <w:tc>
           <w:tcPr>
             <w:tcW w:w="3400" w:type="dxa"/>
@@ -12562,12 +11961,6 @@
         </w:tc>
       </w:tr>
       <w:tr>
-        <w:tblPrEx>
-          <w:tblCellMar>
-            <w:top w:w="0" w:type="dxa"/>
-            <w:bottom w:w="0" w:type="dxa"/>
-          </w:tblCellMar>
-        </w:tblPrEx>
         <w:tc>
           <w:tcPr>
             <w:tcW w:w="3400" w:type="dxa"/>
@@ -12626,12 +12019,6 @@
         </w:tc>
       </w:tr>
       <w:tr>
-        <w:tblPrEx>
-          <w:tblCellMar>
-            <w:top w:w="0" w:type="dxa"/>
-            <w:bottom w:w="0" w:type="dxa"/>
-          </w:tblCellMar>
-        </w:tblPrEx>
         <w:tc>
           <w:tcPr>
             <w:tcW w:w="3400" w:type="dxa"/>
@@ -12718,12 +12105,6 @@
         </w:tc>
       </w:tr>
       <w:tr>
-        <w:tblPrEx>
-          <w:tblCellMar>
-            <w:top w:w="0" w:type="dxa"/>
-            <w:bottom w:w="0" w:type="dxa"/>
-          </w:tblCellMar>
-        </w:tblPrEx>
         <w:tc>
           <w:tcPr>
             <w:tcW w:w="3400" w:type="dxa"/>
@@ -12810,12 +12191,6 @@
         </w:tc>
       </w:tr>
       <w:tr>
-        <w:tblPrEx>
-          <w:tblCellMar>
-            <w:top w:w="0" w:type="dxa"/>
-            <w:bottom w:w="0" w:type="dxa"/>
-          </w:tblCellMar>
-        </w:tblPrEx>
         <w:tc>
           <w:tcPr>
             <w:tcW w:w="3400" w:type="dxa"/>
@@ -12902,12 +12277,6 @@
         </w:tc>
       </w:tr>
       <w:tr>
-        <w:tblPrEx>
-          <w:tblCellMar>
-            <w:top w:w="0" w:type="dxa"/>
-            <w:bottom w:w="0" w:type="dxa"/>
-          </w:tblCellMar>
-        </w:tblPrEx>
         <w:tc>
           <w:tcPr>
             <w:tcW w:w="3400" w:type="dxa"/>
@@ -13004,12 +12373,6 @@
         </w:tc>
       </w:tr>
       <w:tr>
-        <w:tblPrEx>
-          <w:tblCellMar>
-            <w:top w:w="0" w:type="dxa"/>
-            <w:bottom w:w="0" w:type="dxa"/>
-          </w:tblCellMar>
-        </w:tblPrEx>
         <w:tc>
           <w:tcPr>
             <w:tcW w:w="3400" w:type="dxa"/>
@@ -13114,12 +12477,6 @@
         <w:gridCol w:w="9360"/>
       </w:tblGrid>
       <w:tr>
-        <w:tblPrEx>
-          <w:tblCellMar>
-            <w:top w:w="0" w:type="dxa"/>
-            <w:bottom w:w="0" w:type="dxa"/>
-          </w:tblCellMar>
-        </w:tblPrEx>
         <w:tc>
           <w:tcPr>
             <w:tcW w:w="9360" w:type="dxa"/>
@@ -13708,12 +13065,6 @@
         <w:gridCol w:w="9360"/>
       </w:tblGrid>
       <w:tr>
-        <w:tblPrEx>
-          <w:tblCellMar>
-            <w:top w:w="0" w:type="dxa"/>
-            <w:bottom w:w="0" w:type="dxa"/>
-          </w:tblCellMar>
-        </w:tblPrEx>
         <w:tc>
           <w:tcPr>
             <w:tcW w:w="9360" w:type="dxa"/>
@@ -14085,12 +13436,6 @@
         <w:gridCol w:w="9360"/>
       </w:tblGrid>
       <w:tr>
-        <w:tblPrEx>
-          <w:tblCellMar>
-            <w:top w:w="0" w:type="dxa"/>
-            <w:bottom w:w="0" w:type="dxa"/>
-          </w:tblCellMar>
-        </w:tblPrEx>
         <w:tc>
           <w:tcPr>
             <w:tcW w:w="9360" w:type="dxa"/>

</xml_diff>